<commit_message>
feat(solr): add SolrCloud runbook and sharded setup
Co-authored-by: Cursor <cursoragent@cursor.com>
</commit_message>
<xml_diff>
--- a/docs/Lab_13_Report.docx
+++ b/docs/Lab_13_Report.docx
@@ -2605,7 +2605,7 @@
           <w:color w:val="103A71"/>
           <w:sz w:val="26"/>
         </w:rPr>
-        <w:t>3.1 Solr installation</w:t>
+        <w:t>3.1 Solr installation and SolrCloud cluster</w:t>
       </w:r>
     </w:p>
     <w:p>
@@ -2642,7 +2642,7 @@
           <w:i w:val="0"/>
           <w:sz w:val="22"/>
         </w:rPr>
-        <w:t>Mode:</w:t>
+        <w:t>Recommended mode for this lab:</w:t>
       </w:r>
       <w:r>
         <w:rPr>
@@ -2651,7 +2651,7 @@
           <w:i w:val="0"/>
           <w:sz w:val="22"/>
         </w:rPr>
-        <w:t xml:space="preserve"> standalone (single node) on port 8983</w:t>
+        <w:t xml:space="preserve"> SolrCloud on a single machine</w:t>
       </w:r>
     </w:p>
     <w:p>
@@ -2665,7 +2665,7 @@
           <w:i w:val="0"/>
           <w:sz w:val="22"/>
         </w:rPr>
-        <w:t>Core name:</w:t>
+        <w:t>Node 1:</w:t>
       </w:r>
       <w:r>
         <w:rPr>
@@ -2683,7 +2683,21 @@
           <w:i w:val="0"/>
           <w:sz w:val="20"/>
         </w:rPr>
-        <w:t>books</w:t>
+        <w:t>localhost:8983</w:t>
+      </w:r>
+    </w:p>
+    <w:p>
+      <w:pPr>
+        <w:pStyle w:val="ListBullet"/>
+      </w:pPr>
+      <w:r>
+        <w:rPr>
+          <w:rFonts w:ascii="Calibri" w:hAnsi="Calibri"/>
+          <w:b/>
+          <w:i w:val="0"/>
+          <w:sz w:val="22"/>
+        </w:rPr>
+        <w:t>Node 2:</w:t>
       </w:r>
       <w:r>
         <w:rPr>
@@ -2692,7 +2706,7 @@
           <w:i w:val="0"/>
           <w:sz w:val="22"/>
         </w:rPr>
-        <w:t xml:space="preserve"> (created with </w:t>
+        <w:t xml:space="preserve"> </w:t>
       </w:r>
       <w:r>
         <w:rPr>
@@ -2701,7 +2715,21 @@
           <w:i w:val="0"/>
           <w:sz w:val="20"/>
         </w:rPr>
-        <w:t>solr create -c books</w:t>
+        <w:t>localhost:7574</w:t>
+      </w:r>
+    </w:p>
+    <w:p>
+      <w:pPr>
+        <w:pStyle w:val="ListBullet"/>
+      </w:pPr>
+      <w:r>
+        <w:rPr>
+          <w:rFonts w:ascii="Calibri" w:hAnsi="Calibri"/>
+          <w:b/>
+          <w:i w:val="0"/>
+          <w:sz w:val="22"/>
+        </w:rPr>
+        <w:t>Embedded ZooKeeper:</w:t>
       </w:r>
       <w:r>
         <w:rPr>
@@ -2710,7 +2738,94 @@
           <w:i w:val="0"/>
           <w:sz w:val="22"/>
         </w:rPr>
-        <w:t>)</w:t>
+        <w:t xml:space="preserve"> </w:t>
+      </w:r>
+      <w:r>
+        <w:rPr>
+          <w:rFonts w:ascii="Consolas" w:hAnsi="Consolas"/>
+          <w:b w:val="0"/>
+          <w:i w:val="0"/>
+          <w:sz w:val="20"/>
+        </w:rPr>
+        <w:t>localhost:9983</w:t>
+      </w:r>
+    </w:p>
+    <w:p>
+      <w:pPr>
+        <w:pStyle w:val="ListBullet"/>
+      </w:pPr>
+      <w:r>
+        <w:rPr>
+          <w:rFonts w:ascii="Calibri" w:hAnsi="Calibri"/>
+          <w:b/>
+          <w:i w:val="0"/>
+          <w:sz w:val="22"/>
+        </w:rPr>
+        <w:t>Collection name:</w:t>
+      </w:r>
+      <w:r>
+        <w:rPr>
+          <w:rFonts w:ascii="Calibri" w:hAnsi="Calibri"/>
+          <w:b w:val="0"/>
+          <w:i w:val="0"/>
+          <w:sz w:val="22"/>
+        </w:rPr>
+        <w:t xml:space="preserve"> </w:t>
+      </w:r>
+      <w:r>
+        <w:rPr>
+          <w:rFonts w:ascii="Consolas" w:hAnsi="Consolas"/>
+          <w:b w:val="0"/>
+          <w:i w:val="0"/>
+          <w:sz w:val="20"/>
+        </w:rPr>
+        <w:t>books</w:t>
+      </w:r>
+    </w:p>
+    <w:p>
+      <w:pPr>
+        <w:pStyle w:val="ListBullet"/>
+      </w:pPr>
+      <w:r>
+        <w:rPr>
+          <w:rFonts w:ascii="Calibri" w:hAnsi="Calibri"/>
+          <w:b/>
+          <w:i w:val="0"/>
+          <w:sz w:val="22"/>
+        </w:rPr>
+        <w:t>Shards:</w:t>
+      </w:r>
+      <w:r>
+        <w:rPr>
+          <w:rFonts w:ascii="Calibri" w:hAnsi="Calibri"/>
+          <w:b w:val="0"/>
+          <w:i w:val="0"/>
+          <w:sz w:val="22"/>
+        </w:rPr>
+        <w:t xml:space="preserve"> 2</w:t>
+      </w:r>
+    </w:p>
+    <w:p>
+      <w:pPr>
+        <w:pStyle w:val="ListBullet"/>
+      </w:pPr>
+      <w:r>
+        <w:rPr>
+          <w:rFonts w:ascii="Calibri" w:hAnsi="Calibri"/>
+          <w:b/>
+          <w:i w:val="0"/>
+          <w:sz w:val="22"/>
+        </w:rPr>
+        <w:t>Replication factor:</w:t>
+      </w:r>
+      <w:r>
+        <w:rPr>
+          <w:rFonts w:ascii="Calibri" w:hAnsi="Calibri"/>
+          <w:b w:val="0"/>
+          <w:i w:val="0"/>
+          <w:sz w:val="22"/>
+        </w:rPr>
+        <w:t xml:space="preserve"> 2</w:t>
       </w:r>
     </w:p>
     <w:p>
@@ -2724,7 +2839,7 @@
           <w:i w:val="0"/>
           <w:sz w:val="22"/>
         </w:rPr>
-        <w:t xml:space="preserve">The lab also includes guidance for SolrCloud (sharded mode) — the scripts parametrise </w:t>
+        <w:t xml:space="preserve">The project includes </w:t>
       </w:r>
       <w:r>
         <w:rPr>
@@ -2733,7 +2848,7 @@
           <w:i w:val="0"/>
           <w:sz w:val="20"/>
         </w:rPr>
-        <w:t>SOLR_PORT</w:t>
+        <w:t>scripts/setup_solrcloud.sh</w:t>
       </w:r>
       <w:r>
         <w:rPr>
@@ -2742,7 +2857,21 @@
           <w:i w:val="0"/>
           <w:sz w:val="22"/>
         </w:rPr>
-        <w:t xml:space="preserve"> and </w:t>
+        <w:t>, which creates a real two-node SolrCloud cluster on one host. The collection has two logical shards and two replicas, giving four physical cores distributed across the two Solr nodes. This satisfies the lab prerequisite to create a cluster of servers (shards) while remaining easy to reproduce on a laptop.</w:t>
+      </w:r>
+    </w:p>
+    <w:p>
+      <w:pPr>
+        <w:spacing w:after="120"/>
+      </w:pPr>
+      <w:r>
+        <w:rPr>
+          <w:rFonts w:ascii="Calibri" w:hAnsi="Calibri"/>
+          <w:b w:val="0"/>
+          <w:i w:val="0"/>
+          <w:sz w:val="22"/>
+        </w:rPr>
+        <w:t xml:space="preserve">For a simpler non-cloud demonstration, </w:t>
       </w:r>
       <w:r>
         <w:rPr>
@@ -2751,7 +2880,7 @@
           <w:i w:val="0"/>
           <w:sz w:val="20"/>
         </w:rPr>
-        <w:t>CORE_NAME</w:t>
+        <w:t>scripts/setup_solr.sh</w:t>
       </w:r>
       <w:r>
         <w:rPr>
@@ -2760,7 +2889,25 @@
           <w:i w:val="0"/>
           <w:sz w:val="22"/>
         </w:rPr>
-        <w:t xml:space="preserve"> so the same workflow applies to a collection in cloud mode.</w:t>
+        <w:t xml:space="preserve"> can create a standalone </w:t>
+      </w:r>
+      <w:r>
+        <w:rPr>
+          <w:rFonts w:ascii="Consolas" w:hAnsi="Consolas"/>
+          <w:b w:val="0"/>
+          <w:i w:val="0"/>
+          <w:sz w:val="20"/>
+        </w:rPr>
+        <w:t>books</w:t>
+      </w:r>
+      <w:r>
+        <w:rPr>
+          <w:rFonts w:ascii="Calibri" w:hAnsi="Calibri"/>
+          <w:b w:val="0"/>
+          <w:i w:val="0"/>
+          <w:sz w:val="22"/>
+        </w:rPr>
+        <w:t xml:space="preserve"> core, but the screenshots and final evaluation use SolrCloud mode.</w:t>
       </w:r>
     </w:p>
     <w:p>
@@ -2842,7 +2989,7 @@
           <w:i w:val="0"/>
           <w:sz w:val="22"/>
         </w:rPr>
-        <w:t xml:space="preserve"> to push the field types, fields and copyFields. This makes the operation idempotent and safer in production. A reference XML schema (</w:t>
+        <w:t xml:space="preserve"> to push the field types, fields and copyFields. Before the schema is applied, </w:t>
       </w:r>
       <w:r>
         <w:rPr>
@@ -2851,7 +2998,7 @@
           <w:i w:val="0"/>
           <w:sz w:val="20"/>
         </w:rPr>
-        <w:t>solr-config/managed-schema.xml</w:t>
+        <w:t>scripts/install_resources.sh</w:t>
       </w:r>
       <w:r>
         <w:rPr>
@@ -2860,7 +3007,93 @@
           <w:i w:val="0"/>
           <w:sz w:val="22"/>
         </w:rPr>
-        <w:t>) is also checked in for completeness.</w:t>
+        <w:t xml:space="preserve"> copies </w:t>
+      </w:r>
+      <w:r>
+        <w:rPr>
+          <w:rFonts w:ascii="Consolas" w:hAnsi="Consolas"/>
+          <w:b w:val="0"/>
+          <w:i w:val="0"/>
+          <w:sz w:val="20"/>
+        </w:rPr>
+        <w:t>synonyms.txt</w:t>
+      </w:r>
+      <w:r>
+        <w:rPr>
+          <w:rFonts w:ascii="Calibri" w:hAnsi="Calibri"/>
+          <w:b w:val="0"/>
+          <w:i w:val="0"/>
+          <w:sz w:val="22"/>
+        </w:rPr>
+        <w:t xml:space="preserve"> and </w:t>
+      </w:r>
+      <w:r>
+        <w:rPr>
+          <w:rFonts w:ascii="Consolas" w:hAnsi="Consolas"/>
+          <w:b w:val="0"/>
+          <w:i w:val="0"/>
+          <w:sz w:val="20"/>
+        </w:rPr>
+        <w:t>stopwords.txt</w:t>
+      </w:r>
+      <w:r>
+        <w:rPr>
+          <w:rFonts w:ascii="Calibri" w:hAnsi="Calibri"/>
+          <w:b w:val="0"/>
+          <w:i w:val="0"/>
+          <w:sz w:val="22"/>
+        </w:rPr>
+        <w:t xml:space="preserve"> into the active core configuration (standalone) or into ZooKeeper (SolrCloud). This ensures that the </w:t>
+      </w:r>
+      <w:r>
+        <w:rPr>
+          <w:rFonts w:ascii="Consolas" w:hAnsi="Consolas"/>
+          <w:b w:val="0"/>
+          <w:i w:val="0"/>
+          <w:sz w:val="20"/>
+        </w:rPr>
+        <w:t>text_en</w:t>
+      </w:r>
+      <w:r>
+        <w:rPr>
+          <w:rFonts w:ascii="Calibri" w:hAnsi="Calibri"/>
+          <w:b w:val="0"/>
+          <w:i w:val="0"/>
+          <w:sz w:val="22"/>
+        </w:rPr>
+        <w:t xml:space="preserve"> analyzer can resolve the custom synonym and stopword resources.</w:t>
+      </w:r>
+    </w:p>
+    <w:p>
+      <w:pPr>
+        <w:spacing w:after="120"/>
+      </w:pPr>
+      <w:r>
+        <w:rPr>
+          <w:rFonts w:ascii="Calibri" w:hAnsi="Calibri"/>
+          <w:b w:val="0"/>
+          <w:i w:val="0"/>
+          <w:sz w:val="22"/>
+        </w:rPr>
+        <w:t>A reference XML schema (</w:t>
+      </w:r>
+      <w:r>
+        <w:rPr>
+          <w:rFonts w:ascii="Consolas" w:hAnsi="Consolas"/>
+          <w:b w:val="0"/>
+          <w:i w:val="0"/>
+          <w:sz w:val="20"/>
+        </w:rPr>
+        <w:t>solr-config/managed-schema.xml</w:t>
+      </w:r>
+      <w:r>
+        <w:rPr>
+          <w:rFonts w:ascii="Calibri" w:hAnsi="Calibri"/>
+          <w:b w:val="0"/>
+          <w:i w:val="0"/>
+          <w:sz w:val="22"/>
+        </w:rPr>
+        <w:t>) is also checked in for documentation and review.</w:t>
       </w:r>
     </w:p>
     <w:p>
@@ -3682,7 +3915,7 @@
                 <w:rFonts w:ascii="Consolas" w:hAnsi="Consolas"/>
                 <w:sz w:val="19"/>
               </w:rPr>
-              <w:t>bash scripts/setup_solr.sh</w:t>
+              <w:t>bash scripts/setup_solrcloud.sh</w:t>
               <w:br/>
             </w:r>
           </w:p>
@@ -3700,7 +3933,7 @@
           <w:i w:val="0"/>
           <w:sz w:val="22"/>
         </w:rPr>
-        <w:t xml:space="preserve">This idempotent script starts Solr on port 8983 (if not already running), creates the </w:t>
+        <w:t xml:space="preserve">This idempotent script starts Solr node 1 on port 8983, Solr node 2 on port 7574, launches embedded ZooKeeper, and creates the </w:t>
       </w:r>
       <w:r>
         <w:rPr>
@@ -3718,7 +3951,7 @@
           <w:i w:val="0"/>
           <w:sz w:val="22"/>
         </w:rPr>
-        <w:t xml:space="preserve"> core if it does not already exist, and applies the project schema via the Schema API.</w:t>
+        <w:t xml:space="preserve"> collection with 2 shards and replication factor 2.</w:t>
       </w:r>
     </w:p>
     <w:p>
@@ -3768,6 +4001,22 @@
                 <w:rFonts w:ascii="Consolas" w:hAnsi="Consolas"/>
                 <w:sz w:val="19"/>
               </w:rPr>
+              <w:t>bash   scripts/install_resources.sh     # pushes synonyms/stopwords</w:t>
+              <w:br/>
+            </w:r>
+            <w:r>
+              <w:rPr>
+                <w:rFonts w:ascii="Consolas" w:hAnsi="Consolas"/>
+                <w:sz w:val="19"/>
+              </w:rPr>
+              <w:t>bash   scripts/apply_schema.sh          # applies text_en/text_suggest + fields</w:t>
+              <w:br/>
+            </w:r>
+            <w:r>
+              <w:rPr>
+                <w:rFonts w:ascii="Consolas" w:hAnsi="Consolas"/>
+                <w:sz w:val="19"/>
+              </w:rPr>
               <w:t>bash   scripts/index_data.sh            # JSON ingestion (default)</w:t>
               <w:br/>
             </w:r>
@@ -5409,38 +5658,70 @@
     </w:p>
     <w:p>
       <w:pPr>
-        <w:ind w:left="283"/>
+        <w:spacing w:after="120"/>
       </w:pPr>
       <w:r>
         <w:rPr>
-          <w:i/>
-          <w:color w:val="404A60"/>
-        </w:rPr>
-        <w:t>Place screenshots in `docs/screenshots/`. Suggested captures (each backed by</w:t>
-      </w:r>
-    </w:p>
-    <w:p>
-      <w:pPr>
-        <w:ind w:left="283"/>
-      </w:pPr>
-      <w:r>
-        <w:rPr>
-          <w:i/>
-          <w:color w:val="404A60"/>
-        </w:rPr>
-        <w:t>a script in this repo so the screenshots match what reviewers can reproduce</w:t>
-      </w:r>
-    </w:p>
-    <w:p>
-      <w:pPr>
-        <w:ind w:left="283"/>
-      </w:pPr>
-      <w:r>
-        <w:rPr>
-          <w:i/>
-          <w:color w:val="404A60"/>
-        </w:rPr>
-        <w:t>on their own machines):</w:t>
+          <w:rFonts w:ascii="Calibri" w:hAnsi="Calibri"/>
+          <w:b w:val="0"/>
+          <w:i w:val="0"/>
+          <w:sz w:val="22"/>
+        </w:rPr>
+        <w:t xml:space="preserve">Screenshots should be captured by following </w:t>
+      </w:r>
+      <w:r>
+        <w:rPr>
+          <w:rFonts w:ascii="Consolas" w:hAnsi="Consolas"/>
+          <w:b w:val="0"/>
+          <w:i w:val="0"/>
+          <w:sz w:val="20"/>
+        </w:rPr>
+        <w:t>docs/RUN_STEP_BY_STEP.md</w:t>
+      </w:r>
+      <w:r>
+        <w:rPr>
+          <w:rFonts w:ascii="Calibri" w:hAnsi="Calibri"/>
+          <w:b w:val="0"/>
+          <w:i w:val="0"/>
+          <w:sz w:val="22"/>
+        </w:rPr>
+        <w:t xml:space="preserve">. Each file is saved in </w:t>
+      </w:r>
+      <w:r>
+        <w:rPr>
+          <w:rFonts w:ascii="Consolas" w:hAnsi="Consolas"/>
+          <w:b w:val="0"/>
+          <w:i w:val="0"/>
+          <w:sz w:val="20"/>
+        </w:rPr>
+        <w:t>docs/screenshots/</w:t>
+      </w:r>
+      <w:r>
+        <w:rPr>
+          <w:rFonts w:ascii="Calibri" w:hAnsi="Calibri"/>
+          <w:b w:val="0"/>
+          <w:i w:val="0"/>
+          <w:sz w:val="22"/>
+        </w:rPr>
+        <w:t xml:space="preserve"> and embedded in the final Word document using </w:t>
+      </w:r>
+      <w:r>
+        <w:rPr>
+          <w:rFonts w:ascii="Consolas" w:hAnsi="Consolas"/>
+          <w:b w:val="0"/>
+          <w:i w:val="0"/>
+          <w:sz w:val="20"/>
+        </w:rPr>
+        <w:t>docs/generate_report.py</w:t>
+      </w:r>
+      <w:r>
+        <w:rPr>
+          <w:rFonts w:ascii="Calibri" w:hAnsi="Calibri"/>
+          <w:b w:val="0"/>
+          <w:i w:val="0"/>
+          <w:sz w:val="22"/>
+        </w:rPr>
+        <w:t>.</w:t>
       </w:r>
     </w:p>
     <w:tbl>
@@ -5505,7 +5786,7 @@
                 <w:i w:val="0"/>
                 <w:sz w:val="20"/>
               </w:rPr>
-              <w:t>01-solr-admin.png</w:t>
+              <w:t>01-solrcloud-graph.png</w:t>
             </w:r>
           </w:p>
         </w:tc>
@@ -5526,7 +5807,7 @@
                 <w:i w:val="0"/>
                 <w:sz w:val="20"/>
               </w:rPr>
-              <w:t xml:space="preserve">Solr Admin UI showing the </w:t>
+              <w:t xml:space="preserve">SolrCloud graph showing two live nodes and the </w:t>
             </w:r>
             <w:r>
               <w:rPr>
@@ -5544,7 +5825,7 @@
                 <w:i w:val="0"/>
                 <w:sz w:val="20"/>
               </w:rPr>
-              <w:t xml:space="preserve"> core with 250 docs</w:t>
+              <w:t xml:space="preserve"> collection</w:t>
             </w:r>
           </w:p>
         </w:tc>
@@ -5567,7 +5848,7 @@
                 <w:i w:val="0"/>
                 <w:sz w:val="20"/>
               </w:rPr>
-              <w:t>02-schema-fields.png</w:t>
+              <w:t>02-collection-shards.png</w:t>
             </w:r>
           </w:p>
         </w:tc>
@@ -5588,7 +5869,7 @@
                 <w:i w:val="0"/>
                 <w:sz w:val="20"/>
               </w:rPr>
-              <w:t>Schema browser listing the custom fields</w:t>
+              <w:t>Collection details showing 2 shards and 2 replicas</w:t>
             </w:r>
           </w:p>
         </w:tc>
@@ -5611,7 +5892,7 @@
                 <w:i w:val="0"/>
                 <w:sz w:val="20"/>
               </w:rPr>
-              <w:t>03-curl-index.png</w:t>
+              <w:t>03-install-resources.png</w:t>
             </w:r>
           </w:p>
         </w:tc>
@@ -5632,25 +5913,7 @@
                 <w:i w:val="0"/>
                 <w:sz w:val="20"/>
               </w:rPr>
-              <w:t xml:space="preserve">Terminal output of </w:t>
-            </w:r>
-            <w:r>
-              <w:rPr>
-                <w:rFonts w:ascii="Consolas" w:hAnsi="Consolas"/>
-                <w:b w:val="0"/>
-                <w:i w:val="0"/>
-                <w:sz w:val="20"/>
-              </w:rPr>
-              <w:t>index_data.sh</w:t>
-            </w:r>
-            <w:r>
-              <w:rPr>
-                <w:rFonts w:ascii="Calibri" w:hAnsi="Calibri"/>
-                <w:b w:val="0"/>
-                <w:i w:val="0"/>
-                <w:sz w:val="20"/>
-              </w:rPr>
-              <w:t xml:space="preserve"> succeeding</w:t>
+              <w:t>Terminal output for synonym/stopword resource installation</w:t>
             </w:r>
           </w:p>
         </w:tc>
@@ -5673,7 +5936,7 @@
                 <w:i w:val="0"/>
                 <w:sz w:val="20"/>
               </w:rPr>
-              <w:t>04-sample-queries.png</w:t>
+              <w:t>04-apply-schema.png</w:t>
             </w:r>
           </w:p>
         </w:tc>
@@ -5694,16 +5957,7 @@
                 <w:i w:val="0"/>
                 <w:sz w:val="20"/>
               </w:rPr>
-              <w:t xml:space="preserve">Output of </w:t>
-            </w:r>
-            <w:r>
-              <w:rPr>
-                <w:rFonts w:ascii="Consolas" w:hAnsi="Consolas"/>
-                <w:b w:val="0"/>
-                <w:i w:val="0"/>
-                <w:sz w:val="20"/>
-              </w:rPr>
-              <w:t>sample_queries.sh</w:t>
+              <w:t>Terminal output for Schema API setup</w:t>
             </w:r>
           </w:p>
         </w:tc>
@@ -5726,7 +5980,7 @@
                 <w:i w:val="0"/>
                 <w:sz w:val="20"/>
               </w:rPr>
-              <w:t>05-app-home.png</w:t>
+              <w:t>05-schema-browser.png</w:t>
             </w:r>
           </w:p>
         </w:tc>
@@ -5747,7 +6001,7 @@
                 <w:i w:val="0"/>
                 <w:sz w:val="20"/>
               </w:rPr>
-              <w:t>The web UI on first load, facets populated</w:t>
+              <w:t>Solr schema browser listing custom fields</w:t>
             </w:r>
           </w:p>
         </w:tc>
@@ -5770,7 +6024,7 @@
                 <w:i w:val="0"/>
                 <w:sz w:val="20"/>
               </w:rPr>
-              <w:t>06-app-search.png</w:t>
+              <w:t>06-generate-dataset.png</w:t>
             </w:r>
           </w:p>
         </w:tc>
@@ -5791,7 +6045,7 @@
                 <w:i w:val="0"/>
                 <w:sz w:val="20"/>
               </w:rPr>
-              <w:t>A live search showing highlighted matches</w:t>
+              <w:t>Terminal output of deterministic dataset generation</w:t>
             </w:r>
           </w:p>
         </w:tc>
@@ -5814,7 +6068,7 @@
                 <w:i w:val="0"/>
                 <w:sz w:val="20"/>
               </w:rPr>
-              <w:t>07-app-facets.png</w:t>
+              <w:t>07-index-data.png</w:t>
             </w:r>
           </w:p>
         </w:tc>
@@ -5835,7 +6089,25 @@
                 <w:i w:val="0"/>
                 <w:sz w:val="20"/>
               </w:rPr>
-              <w:t>Several facets selected, results filtered</w:t>
+              <w:t xml:space="preserve">Terminal output of </w:t>
+            </w:r>
+            <w:r>
+              <w:rPr>
+                <w:rFonts w:ascii="Consolas" w:hAnsi="Consolas"/>
+                <w:b w:val="0"/>
+                <w:i w:val="0"/>
+                <w:sz w:val="20"/>
+              </w:rPr>
+              <w:t>index_data.sh</w:t>
+            </w:r>
+            <w:r>
+              <w:rPr>
+                <w:rFonts w:ascii="Calibri" w:hAnsi="Calibri"/>
+                <w:b w:val="0"/>
+                <w:i w:val="0"/>
+                <w:sz w:val="20"/>
+              </w:rPr>
+              <w:t xml:space="preserve"> showing 250 indexed documents</w:t>
             </w:r>
           </w:p>
         </w:tc>
@@ -5858,7 +6130,7 @@
                 <w:i w:val="0"/>
                 <w:sz w:val="20"/>
               </w:rPr>
-              <w:t>08-app-modal.png</w:t>
+              <w:t>08-doc-count.png</w:t>
             </w:r>
           </w:p>
         </w:tc>
@@ -5879,7 +6151,16 @@
                 <w:i w:val="0"/>
                 <w:sz w:val="20"/>
               </w:rPr>
-              <w:t>Detail modal for a single book</w:t>
+              <w:t xml:space="preserve">Solr Admin query output showing </w:t>
+            </w:r>
+            <w:r>
+              <w:rPr>
+                <w:rFonts w:ascii="Consolas" w:hAnsi="Consolas"/>
+                <w:b w:val="0"/>
+                <w:i w:val="0"/>
+                <w:sz w:val="20"/>
+              </w:rPr>
+              <w:t>numFound: 250</w:t>
             </w:r>
           </w:p>
         </w:tc>
@@ -5902,7 +6183,7 @@
                 <w:i w:val="0"/>
                 <w:sz w:val="20"/>
               </w:rPr>
-              <w:t>09-app-mobile.png</w:t>
+              <w:t>09-sample-queries.png</w:t>
             </w:r>
           </w:p>
         </w:tc>
@@ -5923,7 +6204,412 @@
                 <w:i w:val="0"/>
                 <w:sz w:val="20"/>
               </w:rPr>
-              <w:t>The UI in a 375 × 700 mobile viewport</w:t>
+              <w:t xml:space="preserve">Output of </w:t>
+            </w:r>
+            <w:r>
+              <w:rPr>
+                <w:rFonts w:ascii="Consolas" w:hAnsi="Consolas"/>
+                <w:b w:val="0"/>
+                <w:i w:val="0"/>
+                <w:sz w:val="20"/>
+              </w:rPr>
+              <w:t>sample_queries.sh</w:t>
+            </w:r>
+          </w:p>
+        </w:tc>
+      </w:tr>
+      <w:tr>
+        <w:tc>
+          <w:tcPr>
+            <w:tcW w:type="dxa" w:w="4873"/>
+          </w:tcPr>
+          <w:p>
+            <w:r>
+              <w:rPr>
+                <w:sz w:val="20"/>
+              </w:rPr>
+            </w:r>
+            <w:r>
+              <w:rPr>
+                <w:rFonts w:ascii="Consolas" w:hAnsi="Consolas"/>
+                <w:b w:val="0"/>
+                <w:i w:val="0"/>
+                <w:sz w:val="20"/>
+              </w:rPr>
+              <w:t>10-faceted-search.png</w:t>
+            </w:r>
+          </w:p>
+        </w:tc>
+        <w:tc>
+          <w:tcPr>
+            <w:tcW w:type="dxa" w:w="4873"/>
+          </w:tcPr>
+          <w:p>
+            <w:r>
+              <w:rPr>
+                <w:sz w:val="20"/>
+              </w:rPr>
+            </w:r>
+            <w:r>
+              <w:rPr>
+                <w:rFonts w:ascii="Calibri" w:hAnsi="Calibri"/>
+                <w:b w:val="0"/>
+                <w:i w:val="0"/>
+                <w:sz w:val="20"/>
+              </w:rPr>
+              <w:t>Solr Admin faceted-search output</w:t>
+            </w:r>
+          </w:p>
+        </w:tc>
+      </w:tr>
+      <w:tr>
+        <w:tc>
+          <w:tcPr>
+            <w:tcW w:type="dxa" w:w="4873"/>
+          </w:tcPr>
+          <w:p>
+            <w:r>
+              <w:rPr>
+                <w:sz w:val="20"/>
+              </w:rPr>
+            </w:r>
+            <w:r>
+              <w:rPr>
+                <w:rFonts w:ascii="Consolas" w:hAnsi="Consolas"/>
+                <w:b w:val="0"/>
+                <w:i w:val="0"/>
+                <w:sz w:val="20"/>
+              </w:rPr>
+              <w:t>11-highlighting.png</w:t>
+            </w:r>
+          </w:p>
+        </w:tc>
+        <w:tc>
+          <w:tcPr>
+            <w:tcW w:type="dxa" w:w="4873"/>
+          </w:tcPr>
+          <w:p>
+            <w:r>
+              <w:rPr>
+                <w:sz w:val="20"/>
+              </w:rPr>
+            </w:r>
+            <w:r>
+              <w:rPr>
+                <w:rFonts w:ascii="Calibri" w:hAnsi="Calibri"/>
+                <w:b w:val="0"/>
+                <w:i w:val="0"/>
+                <w:sz w:val="20"/>
+              </w:rPr>
+              <w:t>Solr Admin highlighting output</w:t>
+            </w:r>
+          </w:p>
+        </w:tc>
+      </w:tr>
+      <w:tr>
+        <w:tc>
+          <w:tcPr>
+            <w:tcW w:type="dxa" w:w="4873"/>
+          </w:tcPr>
+          <w:p>
+            <w:r>
+              <w:rPr>
+                <w:sz w:val="20"/>
+              </w:rPr>
+            </w:r>
+            <w:r>
+              <w:rPr>
+                <w:rFonts w:ascii="Consolas" w:hAnsi="Consolas"/>
+                <w:b w:val="0"/>
+                <w:i w:val="0"/>
+                <w:sz w:val="20"/>
+              </w:rPr>
+              <w:t>12-web-ui-home.png</w:t>
+            </w:r>
+          </w:p>
+        </w:tc>
+        <w:tc>
+          <w:tcPr>
+            <w:tcW w:type="dxa" w:w="4873"/>
+          </w:tcPr>
+          <w:p>
+            <w:r>
+              <w:rPr>
+                <w:sz w:val="20"/>
+              </w:rPr>
+            </w:r>
+            <w:r>
+              <w:rPr>
+                <w:rFonts w:ascii="Calibri" w:hAnsi="Calibri"/>
+                <w:b w:val="0"/>
+                <w:i w:val="0"/>
+                <w:sz w:val="20"/>
+              </w:rPr>
+              <w:t>Web UI first load with search bar, facets and results</w:t>
+            </w:r>
+          </w:p>
+        </w:tc>
+      </w:tr>
+      <w:tr>
+        <w:tc>
+          <w:tcPr>
+            <w:tcW w:type="dxa" w:w="4873"/>
+          </w:tcPr>
+          <w:p>
+            <w:r>
+              <w:rPr>
+                <w:sz w:val="20"/>
+              </w:rPr>
+            </w:r>
+            <w:r>
+              <w:rPr>
+                <w:rFonts w:ascii="Consolas" w:hAnsi="Consolas"/>
+                <w:b w:val="0"/>
+                <w:i w:val="0"/>
+                <w:sz w:val="20"/>
+              </w:rPr>
+              <w:t>13-web-search-highlight.png</w:t>
+            </w:r>
+          </w:p>
+        </w:tc>
+        <w:tc>
+          <w:tcPr>
+            <w:tcW w:type="dxa" w:w="4873"/>
+          </w:tcPr>
+          <w:p>
+            <w:r>
+              <w:rPr>
+                <w:sz w:val="20"/>
+              </w:rPr>
+            </w:r>
+            <w:r>
+              <w:rPr>
+                <w:rFonts w:ascii="Calibri" w:hAnsi="Calibri"/>
+                <w:b w:val="0"/>
+                <w:i w:val="0"/>
+                <w:sz w:val="20"/>
+              </w:rPr>
+              <w:t>Live web search with highlighted search terms</w:t>
+            </w:r>
+          </w:p>
+        </w:tc>
+      </w:tr>
+      <w:tr>
+        <w:tc>
+          <w:tcPr>
+            <w:tcW w:type="dxa" w:w="4873"/>
+          </w:tcPr>
+          <w:p>
+            <w:r>
+              <w:rPr>
+                <w:sz w:val="20"/>
+              </w:rPr>
+            </w:r>
+            <w:r>
+              <w:rPr>
+                <w:rFonts w:ascii="Consolas" w:hAnsi="Consolas"/>
+                <w:b w:val="0"/>
+                <w:i w:val="0"/>
+                <w:sz w:val="20"/>
+              </w:rPr>
+              <w:t>14-web-facets-filters.png</w:t>
+            </w:r>
+          </w:p>
+        </w:tc>
+        <w:tc>
+          <w:tcPr>
+            <w:tcW w:type="dxa" w:w="4873"/>
+          </w:tcPr>
+          <w:p>
+            <w:r>
+              <w:rPr>
+                <w:sz w:val="20"/>
+              </w:rPr>
+            </w:r>
+            <w:r>
+              <w:rPr>
+                <w:rFonts w:ascii="Calibri" w:hAnsi="Calibri"/>
+                <w:b w:val="0"/>
+                <w:i w:val="0"/>
+                <w:sz w:val="20"/>
+              </w:rPr>
+              <w:t>Web UI after applying filters/faceted navigation</w:t>
+            </w:r>
+          </w:p>
+        </w:tc>
+      </w:tr>
+      <w:tr>
+        <w:tc>
+          <w:tcPr>
+            <w:tcW w:type="dxa" w:w="4873"/>
+          </w:tcPr>
+          <w:p>
+            <w:r>
+              <w:rPr>
+                <w:sz w:val="20"/>
+              </w:rPr>
+            </w:r>
+            <w:r>
+              <w:rPr>
+                <w:rFonts w:ascii="Consolas" w:hAnsi="Consolas"/>
+                <w:b w:val="0"/>
+                <w:i w:val="0"/>
+                <w:sz w:val="20"/>
+              </w:rPr>
+              <w:t>15-web-autocomplete.png</w:t>
+            </w:r>
+          </w:p>
+        </w:tc>
+        <w:tc>
+          <w:tcPr>
+            <w:tcW w:type="dxa" w:w="4873"/>
+          </w:tcPr>
+          <w:p>
+            <w:r>
+              <w:rPr>
+                <w:sz w:val="20"/>
+              </w:rPr>
+            </w:r>
+            <w:r>
+              <w:rPr>
+                <w:rFonts w:ascii="Calibri" w:hAnsi="Calibri"/>
+                <w:b w:val="0"/>
+                <w:i w:val="0"/>
+                <w:sz w:val="20"/>
+              </w:rPr>
+              <w:t>Autocomplete suggestions in the web UI</w:t>
+            </w:r>
+          </w:p>
+        </w:tc>
+      </w:tr>
+      <w:tr>
+        <w:tc>
+          <w:tcPr>
+            <w:tcW w:type="dxa" w:w="4873"/>
+          </w:tcPr>
+          <w:p>
+            <w:r>
+              <w:rPr>
+                <w:sz w:val="20"/>
+              </w:rPr>
+            </w:r>
+            <w:r>
+              <w:rPr>
+                <w:rFonts w:ascii="Consolas" w:hAnsi="Consolas"/>
+                <w:b w:val="0"/>
+                <w:i w:val="0"/>
+                <w:sz w:val="20"/>
+              </w:rPr>
+              <w:t>16-web-pagination.png</w:t>
+            </w:r>
+          </w:p>
+        </w:tc>
+        <w:tc>
+          <w:tcPr>
+            <w:tcW w:type="dxa" w:w="4873"/>
+          </w:tcPr>
+          <w:p>
+            <w:r>
+              <w:rPr>
+                <w:sz w:val="20"/>
+              </w:rPr>
+            </w:r>
+            <w:r>
+              <w:rPr>
+                <w:rFonts w:ascii="Calibri" w:hAnsi="Calibri"/>
+                <w:b w:val="0"/>
+                <w:i w:val="0"/>
+                <w:sz w:val="20"/>
+              </w:rPr>
+              <w:t>Pagination controls in the web UI</w:t>
+            </w:r>
+          </w:p>
+        </w:tc>
+      </w:tr>
+      <w:tr>
+        <w:tc>
+          <w:tcPr>
+            <w:tcW w:type="dxa" w:w="4873"/>
+          </w:tcPr>
+          <w:p>
+            <w:r>
+              <w:rPr>
+                <w:sz w:val="20"/>
+              </w:rPr>
+            </w:r>
+            <w:r>
+              <w:rPr>
+                <w:rFonts w:ascii="Consolas" w:hAnsi="Consolas"/>
+                <w:b w:val="0"/>
+                <w:i w:val="0"/>
+                <w:sz w:val="20"/>
+              </w:rPr>
+              <w:t>17-web-detail-modal.png</w:t>
+            </w:r>
+          </w:p>
+        </w:tc>
+        <w:tc>
+          <w:tcPr>
+            <w:tcW w:type="dxa" w:w="4873"/>
+          </w:tcPr>
+          <w:p>
+            <w:r>
+              <w:rPr>
+                <w:sz w:val="20"/>
+              </w:rPr>
+            </w:r>
+            <w:r>
+              <w:rPr>
+                <w:rFonts w:ascii="Calibri" w:hAnsi="Calibri"/>
+                <w:b w:val="0"/>
+                <w:i w:val="0"/>
+                <w:sz w:val="20"/>
+              </w:rPr>
+              <w:t>Single-book detail modal</w:t>
+            </w:r>
+          </w:p>
+        </w:tc>
+      </w:tr>
+      <w:tr>
+        <w:tc>
+          <w:tcPr>
+            <w:tcW w:type="dxa" w:w="4873"/>
+          </w:tcPr>
+          <w:p>
+            <w:r>
+              <w:rPr>
+                <w:sz w:val="20"/>
+              </w:rPr>
+            </w:r>
+            <w:r>
+              <w:rPr>
+                <w:rFonts w:ascii="Consolas" w:hAnsi="Consolas"/>
+                <w:b w:val="0"/>
+                <w:i w:val="0"/>
+                <w:sz w:val="20"/>
+              </w:rPr>
+              <w:t>18-web-mobile.png</w:t>
+            </w:r>
+          </w:p>
+        </w:tc>
+        <w:tc>
+          <w:tcPr>
+            <w:tcW w:type="dxa" w:w="4873"/>
+          </w:tcPr>
+          <w:p>
+            <w:r>
+              <w:rPr>
+                <w:sz w:val="20"/>
+              </w:rPr>
+            </w:r>
+            <w:r>
+              <w:rPr>
+                <w:rFonts w:ascii="Calibri" w:hAnsi="Calibri"/>
+                <w:b w:val="0"/>
+                <w:i w:val="0"/>
+                <w:sz w:val="20"/>
+              </w:rPr>
+              <w:t>Responsive mobile layout</w:t>
             </w:r>
           </w:p>
         </w:tc>
@@ -7583,7 +8269,7 @@
           <w:i w:val="0"/>
           <w:sz w:val="22"/>
         </w:rPr>
-        <w:t>SolrCloud / sharding.</w:t>
+        <w:t>Multi-machine SolrCloud.</w:t>
       </w:r>
       <w:r>
         <w:rPr>
@@ -7592,7 +8278,7 @@
           <w:i w:val="0"/>
           <w:sz w:val="22"/>
         </w:rPr>
-        <w:t xml:space="preserve"> Migrate the standalone core into a 2-shard,</w:t>
+        <w:t xml:space="preserve"> The current project uses two SolrCloud nodes on</w:t>
       </w:r>
     </w:p>
     <w:p>
@@ -7606,7 +8292,7 @@
           <w:i w:val="0"/>
           <w:sz w:val="22"/>
         </w:rPr>
-        <w:t>2-replica collection on ZooKeeper to demonstrate distributed indexing and high availability — directly aligned with the PDC course themes.</w:t>
+        <w:t>one laptop. A production extension would place those nodes on separate machines or containers and add an external ZooKeeper ensemble.</w:t>
       </w:r>
     </w:p>
     <w:p>

</xml_diff>

<commit_message>
fix: make Solr 10 runbook flow executable end to end
Co-authored-by: Cursor <cursoragent@cursor.com>
</commit_message>
<xml_diff>
--- a/docs/Lab_13_Report.docx
+++ b/docs/Lab_13_Report.docx
@@ -3592,7 +3592,7 @@
           <w:i w:val="0"/>
           <w:sz w:val="22"/>
         </w:rPr>
-        <w:t xml:space="preserve">A </w:t>
+        <w:t xml:space="preserve">Autocomplete is implemented in two layers. If a Solr </w:t>
       </w:r>
       <w:r>
         <w:rPr>
@@ -3610,16 +3610,16 @@
           <w:i w:val="0"/>
           <w:sz w:val="22"/>
         </w:rPr>
-        <w:t xml:space="preserve"> handler backed by </w:t>
-      </w:r>
-      <w:r>
-        <w:rPr>
-          <w:rFonts w:ascii="Calibri" w:hAnsi="Calibri"/>
-          <w:b/>
+        <w:t xml:space="preserve"> handler is configured, the backend uses it. If not, the backend falls back to the </w:t>
+      </w:r>
+      <w:r>
+        <w:rPr>
+          <w:rFonts w:ascii="Consolas" w:hAnsi="Consolas"/>
+          <w:b w:val="0"/>
           <w:i w:val="0"/>
-          <w:sz w:val="22"/>
-        </w:rPr>
-        <w:t>AnalyzingInfixLookupFactory</w:t>
+          <w:sz w:val="20"/>
+        </w:rPr>
+        <w:t>title_ac</w:t>
       </w:r>
       <w:r>
         <w:rPr>
@@ -3628,7 +3628,7 @@
           <w:i w:val="0"/>
           <w:sz w:val="22"/>
         </w:rPr>
-        <w:t xml:space="preserve"> powers autocomplete, and a </w:t>
+        <w:t xml:space="preserve"> edge-ngram field, so autocomplete still works in a fresh Solr 10 setup without manual </w:t>
       </w:r>
       <w:r>
         <w:rPr>
@@ -3637,7 +3637,7 @@
           <w:i w:val="0"/>
           <w:sz w:val="20"/>
         </w:rPr>
-        <w:t>/spell</w:t>
+        <w:t>solrconfig.xml</w:t>
       </w:r>
       <w:r>
         <w:rPr>
@@ -3646,7 +3646,7 @@
           <w:i w:val="0"/>
           <w:sz w:val="22"/>
         </w:rPr>
-        <w:t xml:space="preserve"> SpellCheckComponent provides "did you mean?" suggestions.</w:t>
+        <w:t xml:space="preserve"> editing. Spellcheck-style demonstrations are included through query examples.</w:t>
       </w:r>
     </w:p>
     <w:p>
@@ -4803,7 +4803,16 @@
                 <w:i w:val="0"/>
                 <w:sz w:val="20"/>
               </w:rPr>
-              <w:t>Solr Suggester or fallback prefix query</w:t>
+              <w:t xml:space="preserve">Solr Suggester when configured; otherwise prefix query on </w:t>
+            </w:r>
+            <w:r>
+              <w:rPr>
+                <w:rFonts w:ascii="Consolas" w:hAnsi="Consolas"/>
+                <w:b w:val="0"/>
+                <w:i w:val="0"/>
+                <w:sz w:val="20"/>
+              </w:rPr>
+              <w:t>title_ac</w:t>
             </w:r>
           </w:p>
         </w:tc>

</xml_diff>